<commit_message>
feat: add help center and refresh training docs
</commit_message>
<xml_diff>
--- a/review-ai-platform/apps/web/public/downloads/ReviewIQ-ordinary-user-manual.docx
+++ b/review-ai-platform/apps/web/public/downloads/ReviewIQ-ordinary-user-manual.docx
@@ -37,7 +37,7 @@
           <w:color w:val="475569"/>
           <w:sz w:val="20"/>
         </w:rPr>
-        <w:t>版本：2026-06-23</w:t>
+        <w:t>版本：2026-06-26</w:t>
         <w:br/>
         <w:t>适用对象：普通业务用户、运营人员、内容分析人员</w:t>
       </w:r>
@@ -363,6 +363,14 @@
       </w:r>
     </w:p>
     <w:p>
+      <w:r>
+        <w:rPr>
+          <w:rFonts w:ascii="Microsoft YaHei" w:hAnsi="Microsoft YaHei" w:eastAsia="Microsoft YaHei"/>
+        </w:rPr>
+        <w:t>本次更新覆盖 2026-06-26 前后的功能和 UI 调整：评论明细增加“更多筛选”抽屉和移动端卡片列表，分析记录增加日志级别筛选，采集和分析删除操作改为站内确认弹窗，失败任务支持重试，移动端表格滚动和行动看板布局也已优化。</w:t>
+      </w:r>
+    </w:p>
+    <w:p>
       <w:pPr>
         <w:pStyle w:val="Heading2"/>
       </w:pPr>
@@ -553,7 +561,7 @@
         </w:rPr>
         <w:drawing>
           <wp:inline xmlns:a="http://schemas.openxmlformats.org/drawingml/2006/main" xmlns:pic="http://schemas.openxmlformats.org/drawingml/2006/picture">
-            <wp:extent cx="5806440" cy="4032250"/>
+            <wp:extent cx="5806440" cy="3266122"/>
             <wp:docPr id="1" name="Picture 1"/>
             <wp:cNvGraphicFramePr>
               <a:graphicFrameLocks noChangeAspect="1"/>
@@ -574,7 +582,7 @@
                   <pic:spPr>
                     <a:xfrm>
                       <a:off x="0" y="0"/>
-                      <a:ext cx="5806440" cy="4032250"/>
+                      <a:ext cx="5806440" cy="3266122"/>
                     </a:xfrm>
                     <a:prstGeom prst="rect"/>
                   </pic:spPr>
@@ -732,7 +740,7 @@
         </w:rPr>
         <w:drawing>
           <wp:inline xmlns:a="http://schemas.openxmlformats.org/drawingml/2006/main" xmlns:pic="http://schemas.openxmlformats.org/drawingml/2006/picture">
-            <wp:extent cx="5806440" cy="4032250"/>
+            <wp:extent cx="5806440" cy="3266122"/>
             <wp:docPr id="2" name="Picture 2"/>
             <wp:cNvGraphicFramePr>
               <a:graphicFrameLocks noChangeAspect="1"/>
@@ -753,7 +761,7 @@
                   <pic:spPr>
                     <a:xfrm>
                       <a:off x="0" y="0"/>
-                      <a:ext cx="5806440" cy="4032250"/>
+                      <a:ext cx="5806440" cy="3266122"/>
                     </a:xfrm>
                     <a:prstGeom prst="rect"/>
                   </pic:spPr>
@@ -922,7 +930,7 @@
         </w:rPr>
         <w:drawing>
           <wp:inline xmlns:a="http://schemas.openxmlformats.org/drawingml/2006/main" xmlns:pic="http://schemas.openxmlformats.org/drawingml/2006/picture">
-            <wp:extent cx="5806440" cy="4032250"/>
+            <wp:extent cx="5806440" cy="3266122"/>
             <wp:docPr id="3" name="Picture 3"/>
             <wp:cNvGraphicFramePr>
               <a:graphicFrameLocks noChangeAspect="1"/>
@@ -943,7 +951,7 @@
                   <pic:spPr>
                     <a:xfrm>
                       <a:off x="0" y="0"/>
-                      <a:ext cx="5806440" cy="4032250"/>
+                      <a:ext cx="5806440" cy="3266122"/>
                     </a:xfrm>
                     <a:prstGeom prst="rect"/>
                   </pic:spPr>
@@ -989,6 +997,14 @@
         <w:rPr>
           <w:rFonts w:ascii="Microsoft YaHei" w:hAnsi="Microsoft YaHei" w:eastAsia="Microsoft YaHei"/>
         </w:rPr>
+        <w:t>页面操作区会优先显示常用按钮，例如“一次采集”“新建监听”“刷新”“开始分析”；删除、重试等低频或危险操作通常放在“更多”菜单中，避免按钮过多导致换行。</w:t>
+      </w:r>
+    </w:p>
+    <w:p>
+      <w:r>
+        <w:rPr>
+          <w:rFonts w:ascii="Microsoft YaHei" w:hAnsi="Microsoft YaHei" w:eastAsia="Microsoft YaHei"/>
+        </w:rPr>
         <w:t>常见状态：</w:t>
       </w:r>
     </w:p>
@@ -1079,7 +1095,7 @@
         </w:rPr>
         <w:drawing>
           <wp:inline xmlns:a="http://schemas.openxmlformats.org/drawingml/2006/main" xmlns:pic="http://schemas.openxmlformats.org/drawingml/2006/picture">
-            <wp:extent cx="5806440" cy="4032250"/>
+            <wp:extent cx="5806440" cy="3266122"/>
             <wp:docPr id="4" name="Picture 4"/>
             <wp:cNvGraphicFramePr>
               <a:graphicFrameLocks noChangeAspect="1"/>
@@ -1100,7 +1116,7 @@
                   <pic:spPr>
                     <a:xfrm>
                       <a:off x="0" y="0"/>
-                      <a:ext cx="5806440" cy="4032250"/>
+                      <a:ext cx="5806440" cy="3266122"/>
                     </a:xfrm>
                     <a:prstGeom prst="rect"/>
                   </pic:spPr>
@@ -1313,6 +1329,17 @@
     </w:p>
     <w:p>
       <w:pPr>
+        <w:pStyle w:val="ListBullet"/>
+      </w:pPr>
+      <w:r>
+        <w:rPr>
+          <w:rFonts w:ascii="Microsoft YaHei" w:hAnsi="Microsoft YaHei" w:eastAsia="Microsoft YaHei"/>
+        </w:rPr>
+        <w:t>点击“删除”后会出现确认弹窗，请先核对任务名称、链接和删除影响，再确认操作。</w:t>
+      </w:r>
+    </w:p>
+    <w:p>
+      <w:pPr>
         <w:pStyle w:val="Heading2"/>
       </w:pPr>
       <w:r>
@@ -1354,7 +1381,7 @@
         </w:rPr>
         <w:drawing>
           <wp:inline xmlns:a="http://schemas.openxmlformats.org/drawingml/2006/main" xmlns:pic="http://schemas.openxmlformats.org/drawingml/2006/picture">
-            <wp:extent cx="5806440" cy="4032250"/>
+            <wp:extent cx="5806440" cy="3266122"/>
             <wp:docPr id="5" name="Picture 5"/>
             <wp:cNvGraphicFramePr>
               <a:graphicFrameLocks noChangeAspect="1"/>
@@ -1375,7 +1402,7 @@
                   <pic:spPr>
                     <a:xfrm>
                       <a:off x="0" y="0"/>
-                      <a:ext cx="5806440" cy="4032250"/>
+                      <a:ext cx="5806440" cy="3266122"/>
                     </a:xfrm>
                     <a:prstGeom prst="rect"/>
                   </pic:spPr>
@@ -1602,7 +1629,7 @@
         <w:rPr>
           <w:rFonts w:ascii="Microsoft YaHei" w:hAnsi="Microsoft YaHei" w:eastAsia="Microsoft YaHei"/>
         </w:rPr>
-        <w:t>提醒：切换页面后监听任务仍应保留在列表中。如果回到页面后看不到刚创建的监听任务，可以先刷新页面；仍不存在时请联系管理员查看接口或数据库记录。</w:t>
+        <w:t>提醒：切换页面后监听任务仍应保留在列表中。如果回到页面后看不到刚创建的监听任务，可以先刷新页面；仍不存在时请联系管理员查看接口或数据库记录。删除监听任务时，历史采集记录和分析任务通常不会被自动删除，但仍要以弹窗提示为准。</w:t>
       </w:r>
     </w:p>
     <w:p>
@@ -1808,6 +1835,17 @@
           <w:rFonts w:ascii="Microsoft YaHei" w:hAnsi="Microsoft YaHei" w:eastAsia="Microsoft YaHei"/>
         </w:rPr>
         <w:t>删除前确认任务名称和链接。</w:t>
+      </w:r>
+    </w:p>
+    <w:p>
+      <w:pPr>
+        <w:pStyle w:val="ListBullet"/>
+      </w:pPr>
+      <w:r>
+        <w:rPr>
+          <w:rFonts w:ascii="Microsoft YaHei" w:hAnsi="Microsoft YaHei" w:eastAsia="Microsoft YaHei"/>
+        </w:rPr>
+        <w:t>系统会使用站内确认弹窗提示删除影响范围，确认前请仔细阅读。</w:t>
       </w:r>
     </w:p>
     <w:p>
@@ -2028,7 +2066,7 @@
         </w:rPr>
         <w:drawing>
           <wp:inline xmlns:a="http://schemas.openxmlformats.org/drawingml/2006/main" xmlns:pic="http://schemas.openxmlformats.org/drawingml/2006/picture">
-            <wp:extent cx="5806440" cy="4032250"/>
+            <wp:extent cx="5806440" cy="3266122"/>
             <wp:docPr id="6" name="Picture 6"/>
             <wp:cNvGraphicFramePr>
               <a:graphicFrameLocks noChangeAspect="1"/>
@@ -2049,7 +2087,7 @@
                   <pic:spPr>
                     <a:xfrm>
                       <a:off x="0" y="0"/>
-                      <a:ext cx="5806440" cy="4032250"/>
+                      <a:ext cx="5806440" cy="3266122"/>
                     </a:xfrm>
                     <a:prstGeom prst="rect"/>
                   </pic:spPr>
@@ -2224,6 +2262,58 @@
         <w:rPr>
           <w:rFonts w:ascii="Microsoft YaHei" w:hAnsi="Microsoft YaHei" w:eastAsia="Microsoft YaHei"/>
         </w:rPr>
+        <w:t>日志查看建议：</w:t>
+      </w:r>
+    </w:p>
+    <w:p>
+      <w:pPr>
+        <w:pStyle w:val="ListBullet"/>
+      </w:pPr>
+      <w:r>
+        <w:rPr>
+          <w:rFonts w:ascii="Microsoft YaHei" w:hAnsi="Microsoft YaHei" w:eastAsia="Microsoft YaHei"/>
+        </w:rPr>
+        <w:t>先看“全部”了解整体流程。</w:t>
+      </w:r>
+    </w:p>
+    <w:p>
+      <w:pPr>
+        <w:pStyle w:val="ListBullet"/>
+      </w:pPr>
+      <w:r>
+        <w:rPr>
+          <w:rFonts w:ascii="Microsoft YaHei" w:hAnsi="Microsoft YaHei" w:eastAsia="Microsoft YaHei"/>
+        </w:rPr>
+        <w:t>任务失败时切到“错误”，优先定位真正失败原因。</w:t>
+      </w:r>
+    </w:p>
+    <w:p>
+      <w:pPr>
+        <w:pStyle w:val="ListBullet"/>
+      </w:pPr>
+      <w:r>
+        <w:rPr>
+          <w:rFonts w:ascii="Microsoft YaHei" w:hAnsi="Microsoft YaHei" w:eastAsia="Microsoft YaHei"/>
+        </w:rPr>
+        <w:t>如果任务部分失败，可切到“警告”查看是否存在数据格式、评论内容或模型返回异常。</w:t>
+      </w:r>
+    </w:p>
+    <w:p>
+      <w:pPr>
+        <w:pStyle w:val="ListBullet"/>
+      </w:pPr>
+      <w:r>
+        <w:rPr>
+          <w:rFonts w:ascii="Microsoft YaHei" w:hAnsi="Microsoft YaHei" w:eastAsia="Microsoft YaHei"/>
+        </w:rPr>
+        <w:t>删除分析任务前，请确认不再需要评论、分析结果、报告分享和行动项。</w:t>
+      </w:r>
+    </w:p>
+    <w:p>
+      <w:r>
+        <w:rPr>
+          <w:rFonts w:ascii="Microsoft YaHei" w:hAnsi="Microsoft YaHei" w:eastAsia="Microsoft YaHei"/>
+        </w:rPr>
         <w:t>如果评论数达到几千或几万条，分析需要等待更久。当前系统已支持批量和并发分析，但实际速度仍取决于模型服务、网络、额度和服务器性能。</w:t>
       </w:r>
     </w:p>
@@ -2459,7 +2549,7 @@
         </w:rPr>
         <w:drawing>
           <wp:inline xmlns:a="http://schemas.openxmlformats.org/drawingml/2006/main" xmlns:pic="http://schemas.openxmlformats.org/drawingml/2006/picture">
-            <wp:extent cx="5806440" cy="4032250"/>
+            <wp:extent cx="5806440" cy="3266122"/>
             <wp:docPr id="7" name="Picture 7"/>
             <wp:cNvGraphicFramePr>
               <a:graphicFrameLocks noChangeAspect="1"/>
@@ -2480,7 +2570,7 @@
                   <pic:spPr>
                     <a:xfrm>
                       <a:off x="0" y="0"/>
-                      <a:ext cx="5806440" cy="4032250"/>
+                      <a:ext cx="5806440" cy="3266122"/>
                     </a:xfrm>
                     <a:prstGeom prst="rect"/>
                   </pic:spPr>
@@ -2518,7 +2608,7 @@
         <w:rPr>
           <w:rFonts w:ascii="Microsoft YaHei" w:hAnsi="Microsoft YaHei" w:eastAsia="Microsoft YaHei"/>
         </w:rPr>
-        <w:t>筛选：按情绪、标签、评分、时间、来源等条件过滤。</w:t>
+        <w:t>筛选：顶部保留情绪、意图、关键词等常用筛选；评分、媒体、来源渠道、分组方式和展示列在“更多筛选”抽屉中。</w:t>
       </w:r>
     </w:p>
     <w:p>
@@ -2563,6 +2653,17 @@
           <w:rFonts w:ascii="Microsoft YaHei" w:hAnsi="Microsoft YaHei" w:eastAsia="Microsoft YaHei"/>
         </w:rPr>
         <w:t>人工修正：对 AI 判断错误的情绪、标签或摘要进行修正。</w:t>
+      </w:r>
+    </w:p>
+    <w:p>
+      <w:pPr>
+        <w:pStyle w:val="ListBullet"/>
+      </w:pPr>
+      <w:r>
+        <w:rPr>
+          <w:rFonts w:ascii="Microsoft YaHei" w:hAnsi="Microsoft YaHei" w:eastAsia="Microsoft YaHei"/>
+        </w:rPr>
+        <w:t>移动端卡片：手机端会用卡片列表展示评论摘要、情绪、意图和时间，并通过分页切换。</w:t>
       </w:r>
     </w:p>
     <w:p>
@@ -2660,7 +2761,7 @@
         </w:rPr>
         <w:drawing>
           <wp:inline xmlns:a="http://schemas.openxmlformats.org/drawingml/2006/main" xmlns:pic="http://schemas.openxmlformats.org/drawingml/2006/picture">
-            <wp:extent cx="5806440" cy="4032250"/>
+            <wp:extent cx="5806440" cy="3266122"/>
             <wp:docPr id="8" name="Picture 8"/>
             <wp:cNvGraphicFramePr>
               <a:graphicFrameLocks noChangeAspect="1"/>
@@ -2681,7 +2782,7 @@
                   <pic:spPr>
                     <a:xfrm>
                       <a:off x="0" y="0"/>
-                      <a:ext cx="5806440" cy="4032250"/>
+                      <a:ext cx="5806440" cy="3266122"/>
                     </a:xfrm>
                     <a:prstGeom prst="rect"/>
                   </pic:spPr>
@@ -2808,6 +2909,14 @@
       </w:r>
     </w:p>
     <w:p>
+      <w:r>
+        <w:rPr>
+          <w:rFonts w:ascii="Microsoft YaHei" w:hAnsi="Microsoft YaHei" w:eastAsia="Microsoft YaHei"/>
+        </w:rPr>
+        <w:t>如果从报告或任务进入行动项看板，可以按状态查看“未处理、处理中、已完成”等事项，并快速修改负责人、优先级和截止日期。手机端看板会自动压缩统计卡片和操作按钮，适合轻量跟进。</w:t>
+      </w:r>
+    </w:p>
+    <w:p>
       <w:pPr>
         <w:pStyle w:val="Heading2"/>
       </w:pPr>
@@ -2850,7 +2959,7 @@
         </w:rPr>
         <w:drawing>
           <wp:inline xmlns:a="http://schemas.openxmlformats.org/drawingml/2006/main" xmlns:pic="http://schemas.openxmlformats.org/drawingml/2006/picture">
-            <wp:extent cx="2377440" cy="5145024"/>
+            <wp:extent cx="2377440" cy="5263423"/>
             <wp:docPr id="9" name="Picture 9"/>
             <wp:cNvGraphicFramePr>
               <a:graphicFrameLocks noChangeAspect="1"/>
@@ -2871,7 +2980,7 @@
                   <pic:spPr>
                     <a:xfrm>
                       <a:off x="0" y="0"/>
-                      <a:ext cx="2377440" cy="5145024"/>
+                      <a:ext cx="2377440" cy="5263423"/>
                     </a:xfrm>
                     <a:prstGeom prst="rect"/>
                   </pic:spPr>
@@ -2909,7 +3018,7 @@
         <w:rPr>
           <w:rFonts w:ascii="Microsoft YaHei" w:hAnsi="Microsoft YaHei" w:eastAsia="Microsoft YaHei"/>
         </w:rPr>
-        <w:t>大表格页面可以横向滚动查看字段。</w:t>
+        <w:t>大表格页面可以横向滚动查看字段，右侧淡出阴影表示还有内容可以滑动。</w:t>
       </w:r>
     </w:p>
     <w:p>
@@ -2920,6 +3029,17 @@
         <w:rPr>
           <w:rFonts w:ascii="Microsoft YaHei" w:hAnsi="Microsoft YaHei" w:eastAsia="Microsoft YaHei"/>
         </w:rPr>
+        <w:t>评论明细在手机上会显示为卡片和分页，不需要强行操作宽表格。</w:t>
+      </w:r>
+    </w:p>
+    <w:p>
+      <w:pPr>
+        <w:pStyle w:val="ListBullet"/>
+      </w:pPr>
+      <w:r>
+        <w:rPr>
+          <w:rFonts w:ascii="Microsoft YaHei" w:hAnsi="Microsoft YaHei" w:eastAsia="Microsoft YaHei"/>
+        </w:rPr>
         <w:t>新建任务时尽量复制完整链接，避免手动输入错误。</w:t>
       </w:r>
     </w:p>
@@ -3331,6 +3451,25 @@
           <w:rFonts w:ascii="Microsoft YaHei" w:hAnsi="Microsoft YaHei" w:eastAsia="Microsoft YaHei"/>
         </w:rPr>
         <w:t>删除后通常不可恢复。请先确认删除的是采集记录、监听任务还是分析任务。如果误删重要数据，请尽快联系管理员检查是否有数据库备份。</w:t>
+      </w:r>
+    </w:p>
+    <w:p>
+      <w:pPr>
+        <w:pStyle w:val="Heading3"/>
+      </w:pPr>
+      <w:r>
+        <w:rPr>
+          <w:rFonts w:ascii="Microsoft YaHei" w:hAnsi="Microsoft YaHei" w:eastAsia="Microsoft YaHei"/>
+        </w:rPr>
+        <w:t>15.8 找不到评分、媒体或来源渠道筛选怎么办？</w:t>
+      </w:r>
+    </w:p>
+    <w:p>
+      <w:r>
+        <w:rPr>
+          <w:rFonts w:ascii="Microsoft YaHei" w:hAnsi="Microsoft YaHei" w:eastAsia="Microsoft YaHei"/>
+        </w:rPr>
+        <w:t>评论明细页顶部只保留高频筛选。评分、是否含媒体、来源渠道、分组和展示列等选项在“更多筛选”抽屉中，点击后即可展开。</w:t>
       </w:r>
     </w:p>
     <w:p>

</xml_diff>

<commit_message>
feat: enhance report export documentation
</commit_message>
<xml_diff>
--- a/review-ai-platform/apps/web/public/downloads/ReviewIQ-ordinary-user-manual.docx
+++ b/review-ai-platform/apps/web/public/downloads/ReviewIQ-ordinary-user-manual.docx
@@ -2333,196 +2333,7 @@
         <w:rPr>
           <w:rFonts w:ascii="Microsoft YaHei" w:hAnsi="Microsoft YaHei" w:eastAsia="Microsoft YaHei"/>
         </w:rPr>
-        <w:t>分析完成后，打开任务报告查看 AI 输出结果。报告通常包括：</w:t>
-      </w:r>
-    </w:p>
-    <w:p>
-      <w:pPr>
-        <w:pStyle w:val="ListBullet"/>
-      </w:pPr>
-      <w:r>
-        <w:rPr>
-          <w:rFonts w:ascii="Microsoft YaHei" w:hAnsi="Microsoft YaHei" w:eastAsia="Microsoft YaHei"/>
-        </w:rPr>
-        <w:t>总体结论。</w:t>
-      </w:r>
-    </w:p>
-    <w:p>
-      <w:pPr>
-        <w:pStyle w:val="ListBullet"/>
-      </w:pPr>
-      <w:r>
-        <w:rPr>
-          <w:rFonts w:ascii="Microsoft YaHei" w:hAnsi="Microsoft YaHei" w:eastAsia="Microsoft YaHei"/>
-        </w:rPr>
-        <w:t>NPS 和情绪分布。</w:t>
-      </w:r>
-    </w:p>
-    <w:p>
-      <w:pPr>
-        <w:pStyle w:val="ListBullet"/>
-      </w:pPr>
-      <w:r>
-        <w:rPr>
-          <w:rFonts w:ascii="Microsoft YaHei" w:hAnsi="Microsoft YaHei" w:eastAsia="Microsoft YaHei"/>
-        </w:rPr>
-        <w:t>用户声音和高频词。</w:t>
-      </w:r>
-    </w:p>
-    <w:p>
-      <w:pPr>
-        <w:pStyle w:val="ListBullet"/>
-      </w:pPr>
-      <w:r>
-        <w:rPr>
-          <w:rFonts w:ascii="Microsoft YaHei" w:hAnsi="Microsoft YaHei" w:eastAsia="Microsoft YaHei"/>
-        </w:rPr>
-        <w:t>核心主题。</w:t>
-      </w:r>
-    </w:p>
-    <w:p>
-      <w:pPr>
-        <w:pStyle w:val="ListBullet"/>
-      </w:pPr>
-      <w:r>
-        <w:rPr>
-          <w:rFonts w:ascii="Microsoft YaHei" w:hAnsi="Microsoft YaHei" w:eastAsia="Microsoft YaHei"/>
-        </w:rPr>
-        <w:t>痛点、机会点和行动建议。</w:t>
-      </w:r>
-    </w:p>
-    <w:p>
-      <w:pPr>
-        <w:pStyle w:val="ListBullet"/>
-      </w:pPr>
-      <w:r>
-        <w:rPr>
-          <w:rFonts w:ascii="Microsoft YaHei" w:hAnsi="Microsoft YaHei" w:eastAsia="Microsoft YaHei"/>
-        </w:rPr>
-        <w:t>可引用的代表性评论。</w:t>
-      </w:r>
-    </w:p>
-    <w:p>
-      <w:r>
-        <w:rPr>
-          <w:rFonts w:ascii="Microsoft YaHei" w:hAnsi="Microsoft YaHei" w:eastAsia="Microsoft YaHei"/>
-        </w:rPr>
-        <w:t>建议阅读顺序：</w:t>
-      </w:r>
-    </w:p>
-    <w:p>
-      <w:pPr>
-        <w:pStyle w:val="ListNumber"/>
-      </w:pPr>
-      <w:r>
-        <w:rPr>
-          <w:rFonts w:ascii="Microsoft YaHei" w:hAnsi="Microsoft YaHei" w:eastAsia="Microsoft YaHei"/>
-        </w:rPr>
-        <w:t>先看总体结论，判断整体态度是正向、中性还是负向。</w:t>
-      </w:r>
-    </w:p>
-    <w:p>
-      <w:pPr>
-        <w:pStyle w:val="ListNumber"/>
-      </w:pPr>
-      <w:r>
-        <w:rPr>
-          <w:rFonts w:ascii="Microsoft YaHei" w:hAnsi="Microsoft YaHei" w:eastAsia="Microsoft YaHei"/>
-        </w:rPr>
-        <w:t>查看 NPS 和情绪分布，理解整体满意度或态度倾向。</w:t>
-      </w:r>
-    </w:p>
-    <w:p>
-      <w:pPr>
-        <w:pStyle w:val="ListNumber"/>
-      </w:pPr>
-      <w:r>
-        <w:rPr>
-          <w:rFonts w:ascii="Microsoft YaHei" w:hAnsi="Microsoft YaHei" w:eastAsia="Microsoft YaHei"/>
-        </w:rPr>
-        <w:t>查看用户声音和主题词，确认评论主要讨论什么。</w:t>
-      </w:r>
-    </w:p>
-    <w:p>
-      <w:pPr>
-        <w:pStyle w:val="ListNumber"/>
-      </w:pPr>
-      <w:r>
-        <w:rPr>
-          <w:rFonts w:ascii="Microsoft YaHei" w:hAnsi="Microsoft YaHei" w:eastAsia="Microsoft YaHei"/>
-        </w:rPr>
-        <w:t>查看痛点和机会点，判断哪些问题值得优先处理。</w:t>
-      </w:r>
-    </w:p>
-    <w:p>
-      <w:pPr>
-        <w:pStyle w:val="ListNumber"/>
-      </w:pPr>
-      <w:r>
-        <w:rPr>
-          <w:rFonts w:ascii="Microsoft YaHei" w:hAnsi="Microsoft YaHei" w:eastAsia="Microsoft YaHei"/>
-        </w:rPr>
-        <w:t>回到评论明细抽查原文，确认报告结论有原始评论支撑。</w:t>
-      </w:r>
-    </w:p>
-    <w:p>
-      <w:r>
-        <w:rPr>
-          <w:rFonts w:ascii="Microsoft YaHei" w:hAnsi="Microsoft YaHei" w:eastAsia="Microsoft YaHei"/>
-        </w:rPr>
-        <w:t>报告使用建议：</w:t>
-      </w:r>
-    </w:p>
-    <w:p>
-      <w:pPr>
-        <w:pStyle w:val="ListBullet"/>
-      </w:pPr>
-      <w:r>
-        <w:rPr>
-          <w:rFonts w:ascii="Microsoft YaHei" w:hAnsi="Microsoft YaHei" w:eastAsia="Microsoft YaHei"/>
-        </w:rPr>
-        <w:t>面向内部复盘时，可以直接使用报告中的主题、痛点和行动建议。</w:t>
-      </w:r>
-    </w:p>
-    <w:p>
-      <w:pPr>
-        <w:pStyle w:val="ListBullet"/>
-      </w:pPr>
-      <w:r>
-        <w:rPr>
-          <w:rFonts w:ascii="Microsoft YaHei" w:hAnsi="Microsoft YaHei" w:eastAsia="Microsoft YaHei"/>
-        </w:rPr>
-        <w:t>面向外部汇报时，建议先复核代表性评论，避免引用敏感内容。</w:t>
-      </w:r>
-    </w:p>
-    <w:p>
-      <w:pPr>
-        <w:pStyle w:val="ListBullet"/>
-      </w:pPr>
-      <w:r>
-        <w:rPr>
-          <w:rFonts w:ascii="Microsoft YaHei" w:hAnsi="Microsoft YaHei" w:eastAsia="Microsoft YaHei"/>
-        </w:rPr>
-        <w:t>如果结论明显不符合原始评论，请使用评论明细抽样核对，并反馈给管理员调整提示词。</w:t>
-      </w:r>
-    </w:p>
-    <w:p>
-      <w:pPr>
-        <w:pStyle w:val="Heading2"/>
-      </w:pPr>
-      <w:r>
-        <w:rPr>
-          <w:rFonts w:ascii="Microsoft YaHei" w:hAnsi="Microsoft YaHei" w:eastAsia="Microsoft YaHei"/>
-        </w:rPr>
-        <w:t>11. 评论明细</w:t>
-      </w:r>
-    </w:p>
-    <w:p>
-      <w:r>
-        <w:rPr>
-          <w:rFonts w:ascii="Microsoft YaHei" w:hAnsi="Microsoft YaHei" w:eastAsia="Microsoft YaHei"/>
-        </w:rPr>
-        <w:t>评论明细用于查看原始评论和 AI 标注结果。</w:t>
+        <w:t>分析完成后，打开任务报告查看 AI 输出结果。新版报告页顶部会显示任务名称、来源、分析类型、生成时间和导出入口，正文会先给出执行摘要，再展示关键指标和详细洞察。</w:t>
       </w:r>
     </w:p>
     <w:p>
@@ -2536,7 +2347,7 @@
           <w:color w:val="475569"/>
           <w:sz w:val="18"/>
         </w:rPr>
-        <w:t>图：评论明细</w:t>
+        <w:t>图：分析报告与导出入口</w:t>
       </w:r>
     </w:p>
     <w:p>
@@ -2558,7 +2369,7 @@
               <a:graphicData uri="http://schemas.openxmlformats.org/drawingml/2006/picture">
                 <pic:pic>
                   <pic:nvPicPr>
-                    <pic:cNvPr id="0" name="07-reviews.png"/>
+                    <pic:cNvPr id="0" name="12-analysis-report.png"/>
                     <pic:cNvPicPr/>
                   </pic:nvPicPr>
                   <pic:blipFill>
@@ -2586,7 +2397,7 @@
         <w:rPr>
           <w:rFonts w:ascii="Microsoft YaHei" w:hAnsi="Microsoft YaHei" w:eastAsia="Microsoft YaHei"/>
         </w:rPr>
-        <w:t>常用能力：</w:t>
+        <w:t>报告通常包括：</w:t>
       </w:r>
     </w:p>
     <w:p>
@@ -2597,7 +2408,7 @@
         <w:rPr>
           <w:rFonts w:ascii="Microsoft YaHei" w:hAnsi="Microsoft YaHei" w:eastAsia="Microsoft YaHei"/>
         </w:rPr>
-        <w:t>搜索：按关键词查找评论。</w:t>
+        <w:t>执行摘要和总体结论。</w:t>
       </w:r>
     </w:p>
     <w:p>
@@ -2608,7 +2419,7 @@
         <w:rPr>
           <w:rFonts w:ascii="Microsoft YaHei" w:hAnsi="Microsoft YaHei" w:eastAsia="Microsoft YaHei"/>
         </w:rPr>
-        <w:t>筛选：顶部保留情绪、意图、关键词等常用筛选；评分、媒体、来源渠道、分组方式和展示列在“更多筛选”抽屉中。</w:t>
+        <w:t>评论样本、正向占比、负向或争议评论、观点支持度等关键指标。</w:t>
       </w:r>
     </w:p>
     <w:p>
@@ -2619,7 +2430,7 @@
         <w:rPr>
           <w:rFonts w:ascii="Microsoft YaHei" w:hAnsi="Microsoft YaHei" w:eastAsia="Microsoft YaHei"/>
         </w:rPr>
-        <w:t>表格列配置：根据当前工作需要调整展示字段。</w:t>
+        <w:t>NPS 和情绪分布。</w:t>
       </w:r>
     </w:p>
     <w:p>
@@ -2630,7 +2441,7 @@
         <w:rPr>
           <w:rFonts w:ascii="Microsoft YaHei" w:hAnsi="Microsoft YaHei" w:eastAsia="Microsoft YaHei"/>
         </w:rPr>
-        <w:t>保存视图：将常用筛选条件保存为视图。</w:t>
+        <w:t>用户声音、高频词和观点聚类。</w:t>
       </w:r>
     </w:p>
     <w:p>
@@ -2641,7 +2452,7 @@
         <w:rPr>
           <w:rFonts w:ascii="Microsoft YaHei" w:hAnsi="Microsoft YaHei" w:eastAsia="Microsoft YaHei"/>
         </w:rPr>
-        <w:t>导出：导出当前筛选结果。</w:t>
+        <w:t>核心主题和动态标签。</w:t>
       </w:r>
     </w:p>
     <w:p>
@@ -2652,7 +2463,7 @@
         <w:rPr>
           <w:rFonts w:ascii="Microsoft YaHei" w:hAnsi="Microsoft YaHei" w:eastAsia="Microsoft YaHei"/>
         </w:rPr>
-        <w:t>人工修正：对 AI 判断错误的情绪、标签或摘要进行修正。</w:t>
+        <w:t>痛点、机会点和行动建议。</w:t>
       </w:r>
     </w:p>
     <w:p>
@@ -2663,15 +2474,89 @@
         <w:rPr>
           <w:rFonts w:ascii="Microsoft YaHei" w:hAnsi="Microsoft YaHei" w:eastAsia="Microsoft YaHei"/>
         </w:rPr>
-        <w:t>移动端卡片：手机端会用卡片列表展示评论摘要、情绪、意图和时间，并通过分页切换。</w:t>
-      </w:r>
-    </w:p>
-    <w:p>
-      <w:r>
-        <w:rPr>
-          <w:rFonts w:ascii="Microsoft YaHei" w:hAnsi="Microsoft YaHei" w:eastAsia="Microsoft YaHei"/>
-        </w:rPr>
-        <w:t>建议用法：</w:t>
+        <w:t>可引用的代表性评论。</w:t>
+      </w:r>
+    </w:p>
+    <w:p>
+      <w:r>
+        <w:rPr>
+          <w:rFonts w:ascii="Microsoft YaHei" w:hAnsi="Microsoft YaHei" w:eastAsia="Microsoft YaHei"/>
+        </w:rPr>
+        <w:t>建议阅读顺序：</w:t>
+      </w:r>
+    </w:p>
+    <w:p>
+      <w:pPr>
+        <w:pStyle w:val="ListNumber"/>
+      </w:pPr>
+      <w:r>
+        <w:rPr>
+          <w:rFonts w:ascii="Microsoft YaHei" w:hAnsi="Microsoft YaHei" w:eastAsia="Microsoft YaHei"/>
+        </w:rPr>
+        <w:t>先看执行摘要，判断整体态度、主要问题和优先关注点。</w:t>
+      </w:r>
+    </w:p>
+    <w:p>
+      <w:pPr>
+        <w:pStyle w:val="ListNumber"/>
+      </w:pPr>
+      <w:r>
+        <w:rPr>
+          <w:rFonts w:ascii="Microsoft YaHei" w:hAnsi="Microsoft YaHei" w:eastAsia="Microsoft YaHei"/>
+        </w:rPr>
+        <w:t>查看报告快照，确认评论样本、正向占比、负向或争议评论、观点支持度等关键指标。</w:t>
+      </w:r>
+    </w:p>
+    <w:p>
+      <w:pPr>
+        <w:pStyle w:val="ListNumber"/>
+      </w:pPr>
+      <w:r>
+        <w:rPr>
+          <w:rFonts w:ascii="Microsoft YaHei" w:hAnsi="Microsoft YaHei" w:eastAsia="Microsoft YaHei"/>
+        </w:rPr>
+        <w:t>查看 NPS、情绪分布、来源分布、意图分布和问题统计，理解评论结构。</w:t>
+      </w:r>
+    </w:p>
+    <w:p>
+      <w:pPr>
+        <w:pStyle w:val="ListNumber"/>
+      </w:pPr>
+      <w:r>
+        <w:rPr>
+          <w:rFonts w:ascii="Microsoft YaHei" w:hAnsi="Microsoft YaHei" w:eastAsia="Microsoft YaHei"/>
+        </w:rPr>
+        <w:t>查看用户声音、高频词和主题词，确认评论主要讨论什么。</w:t>
+      </w:r>
+    </w:p>
+    <w:p>
+      <w:pPr>
+        <w:pStyle w:val="ListNumber"/>
+      </w:pPr>
+      <w:r>
+        <w:rPr>
+          <w:rFonts w:ascii="Microsoft YaHei" w:hAnsi="Microsoft YaHei" w:eastAsia="Microsoft YaHei"/>
+        </w:rPr>
+        <w:t>查看痛点、机会点和行动建议，判断哪些问题值得优先处理。</w:t>
+      </w:r>
+    </w:p>
+    <w:p>
+      <w:pPr>
+        <w:pStyle w:val="ListNumber"/>
+      </w:pPr>
+      <w:r>
+        <w:rPr>
+          <w:rFonts w:ascii="Microsoft YaHei" w:hAnsi="Microsoft YaHei" w:eastAsia="Microsoft YaHei"/>
+        </w:rPr>
+        <w:t>回到评论明细抽查原文，确认报告结论有原始评论支撑。</w:t>
+      </w:r>
+    </w:p>
+    <w:p>
+      <w:r>
+        <w:rPr>
+          <w:rFonts w:ascii="Microsoft YaHei" w:hAnsi="Microsoft YaHei" w:eastAsia="Microsoft YaHei"/>
+        </w:rPr>
+        <w:t>导出报告：</w:t>
       </w:r>
     </w:p>
     <w:p>
@@ -2682,7 +2567,7 @@
         <w:rPr>
           <w:rFonts w:ascii="Microsoft YaHei" w:hAnsi="Microsoft YaHei" w:eastAsia="Microsoft YaHei"/>
         </w:rPr>
-        <w:t>报告结论有疑问时，回到评论明细抽查原文。</w:t>
+        <w:t>点击报告页右上角“导出报告”。</w:t>
       </w:r>
     </w:p>
     <w:p>
@@ -2693,7 +2578,7 @@
         <w:rPr>
           <w:rFonts w:ascii="Microsoft YaHei" w:hAnsi="Microsoft YaHei" w:eastAsia="Microsoft YaHei"/>
         </w:rPr>
-        <w:t>做专题分析时，先筛选关键词，再保存视图。</w:t>
+        <w:t>选择“导出 Markdown”用于内部编辑或知识库沉淀。</w:t>
       </w:r>
     </w:p>
     <w:p>
@@ -2704,7 +2589,7 @@
         <w:rPr>
           <w:rFonts w:ascii="Microsoft YaHei" w:hAnsi="Microsoft YaHei" w:eastAsia="Microsoft YaHei"/>
         </w:rPr>
-        <w:t>交付外部报告前，导出关键评论作为证据。</w:t>
+        <w:t>选择“导出 HTML”用于静态页面归档或发送给同事查看。</w:t>
       </w:r>
     </w:p>
     <w:p>
@@ -2715,7 +2600,48 @@
         <w:rPr>
           <w:rFonts w:ascii="Microsoft YaHei" w:hAnsi="Microsoft YaHei" w:eastAsia="Microsoft YaHei"/>
         </w:rPr>
-        <w:t>发现 AI 误判时，使用人工修正沉淀反馈。</w:t>
+        <w:t>选择“打印 / 保存 PDF”用于正式汇报或留档。</w:t>
+      </w:r>
+    </w:p>
+    <w:p>
+      <w:r>
+        <w:rPr>
+          <w:rFonts w:ascii="Microsoft YaHei" w:hAnsi="Microsoft YaHei" w:eastAsia="Microsoft YaHei"/>
+        </w:rPr>
+        <w:t>报告使用建议：</w:t>
+      </w:r>
+    </w:p>
+    <w:p>
+      <w:pPr>
+        <w:pStyle w:val="ListBullet"/>
+      </w:pPr>
+      <w:r>
+        <w:rPr>
+          <w:rFonts w:ascii="Microsoft YaHei" w:hAnsi="Microsoft YaHei" w:eastAsia="Microsoft YaHei"/>
+        </w:rPr>
+        <w:t>面向内部复盘时，可以直接使用报告中的主题、痛点和行动建议。</w:t>
+      </w:r>
+    </w:p>
+    <w:p>
+      <w:pPr>
+        <w:pStyle w:val="ListBullet"/>
+      </w:pPr>
+      <w:r>
+        <w:rPr>
+          <w:rFonts w:ascii="Microsoft YaHei" w:hAnsi="Microsoft YaHei" w:eastAsia="Microsoft YaHei"/>
+        </w:rPr>
+        <w:t>面向外部汇报时，建议先复核代表性评论，避免引用敏感内容。</w:t>
+      </w:r>
+    </w:p>
+    <w:p>
+      <w:pPr>
+        <w:pStyle w:val="ListBullet"/>
+      </w:pPr>
+      <w:r>
+        <w:rPr>
+          <w:rFonts w:ascii="Microsoft YaHei" w:hAnsi="Microsoft YaHei" w:eastAsia="Microsoft YaHei"/>
+        </w:rPr>
+        <w:t>如果结论明显不符合原始评论，请使用评论明细抽样核对，并反馈给管理员调整提示词。</w:t>
       </w:r>
     </w:p>
     <w:p>
@@ -2726,15 +2652,15 @@
         <w:rPr>
           <w:rFonts w:ascii="Microsoft YaHei" w:hAnsi="Microsoft YaHei" w:eastAsia="Microsoft YaHei"/>
         </w:rPr>
-        <w:t>12. 增长运营</w:t>
-      </w:r>
-    </w:p>
-    <w:p>
-      <w:r>
-        <w:rPr>
-          <w:rFonts w:ascii="Microsoft YaHei" w:hAnsi="Microsoft YaHei" w:eastAsia="Microsoft YaHei"/>
-        </w:rPr>
-        <w:t>增长运营用于把评论洞察转化为运营动作，例如内容选题、问题跟进、用户痛点处理和机会点管理。</w:t>
+        <w:t>11. 评论明细</w:t>
+      </w:r>
+    </w:p>
+    <w:p>
+      <w:r>
+        <w:rPr>
+          <w:rFonts w:ascii="Microsoft YaHei" w:hAnsi="Microsoft YaHei" w:eastAsia="Microsoft YaHei"/>
+        </w:rPr>
+        <w:t>评论明细用于查看原始评论和 AI 标注结果。</w:t>
       </w:r>
     </w:p>
     <w:p>
@@ -2748,7 +2674,7 @@
           <w:color w:val="475569"/>
           <w:sz w:val="18"/>
         </w:rPr>
-        <w:t>图：增长运营</w:t>
+        <w:t>图：评论明细</w:t>
       </w:r>
     </w:p>
     <w:p>
@@ -2770,7 +2696,7 @@
               <a:graphicData uri="http://schemas.openxmlformats.org/drawingml/2006/picture">
                 <pic:pic>
                   <pic:nvPicPr>
-                    <pic:cNvPr id="0" name="08-growth.png"/>
+                    <pic:cNvPr id="0" name="07-reviews.png"/>
                     <pic:cNvPicPr/>
                   </pic:nvPicPr>
                   <pic:blipFill>
@@ -2798,6 +2724,218 @@
         <w:rPr>
           <w:rFonts w:ascii="Microsoft YaHei" w:hAnsi="Microsoft YaHei" w:eastAsia="Microsoft YaHei"/>
         </w:rPr>
+        <w:t>常用能力：</w:t>
+      </w:r>
+    </w:p>
+    <w:p>
+      <w:pPr>
+        <w:pStyle w:val="ListBullet"/>
+      </w:pPr>
+      <w:r>
+        <w:rPr>
+          <w:rFonts w:ascii="Microsoft YaHei" w:hAnsi="Microsoft YaHei" w:eastAsia="Microsoft YaHei"/>
+        </w:rPr>
+        <w:t>搜索：按关键词查找评论。</w:t>
+      </w:r>
+    </w:p>
+    <w:p>
+      <w:pPr>
+        <w:pStyle w:val="ListBullet"/>
+      </w:pPr>
+      <w:r>
+        <w:rPr>
+          <w:rFonts w:ascii="Microsoft YaHei" w:hAnsi="Microsoft YaHei" w:eastAsia="Microsoft YaHei"/>
+        </w:rPr>
+        <w:t>筛选：顶部保留情绪、意图、关键词等常用筛选；评分、媒体、来源渠道、分组方式和展示列在“更多筛选”抽屉中。</w:t>
+      </w:r>
+    </w:p>
+    <w:p>
+      <w:pPr>
+        <w:pStyle w:val="ListBullet"/>
+      </w:pPr>
+      <w:r>
+        <w:rPr>
+          <w:rFonts w:ascii="Microsoft YaHei" w:hAnsi="Microsoft YaHei" w:eastAsia="Microsoft YaHei"/>
+        </w:rPr>
+        <w:t>表格列配置：根据当前工作需要调整展示字段。</w:t>
+      </w:r>
+    </w:p>
+    <w:p>
+      <w:pPr>
+        <w:pStyle w:val="ListBullet"/>
+      </w:pPr>
+      <w:r>
+        <w:rPr>
+          <w:rFonts w:ascii="Microsoft YaHei" w:hAnsi="Microsoft YaHei" w:eastAsia="Microsoft YaHei"/>
+        </w:rPr>
+        <w:t>保存视图：将常用筛选条件保存为视图。</w:t>
+      </w:r>
+    </w:p>
+    <w:p>
+      <w:pPr>
+        <w:pStyle w:val="ListBullet"/>
+      </w:pPr>
+      <w:r>
+        <w:rPr>
+          <w:rFonts w:ascii="Microsoft YaHei" w:hAnsi="Microsoft YaHei" w:eastAsia="Microsoft YaHei"/>
+        </w:rPr>
+        <w:t>导出：导出当前筛选结果。</w:t>
+      </w:r>
+    </w:p>
+    <w:p>
+      <w:pPr>
+        <w:pStyle w:val="ListBullet"/>
+      </w:pPr>
+      <w:r>
+        <w:rPr>
+          <w:rFonts w:ascii="Microsoft YaHei" w:hAnsi="Microsoft YaHei" w:eastAsia="Microsoft YaHei"/>
+        </w:rPr>
+        <w:t>人工修正：对 AI 判断错误的情绪、标签或摘要进行修正。</w:t>
+      </w:r>
+    </w:p>
+    <w:p>
+      <w:pPr>
+        <w:pStyle w:val="ListBullet"/>
+      </w:pPr>
+      <w:r>
+        <w:rPr>
+          <w:rFonts w:ascii="Microsoft YaHei" w:hAnsi="Microsoft YaHei" w:eastAsia="Microsoft YaHei"/>
+        </w:rPr>
+        <w:t>移动端卡片：手机端会用卡片列表展示评论摘要、情绪、意图和时间，并通过分页切换。</w:t>
+      </w:r>
+    </w:p>
+    <w:p>
+      <w:r>
+        <w:rPr>
+          <w:rFonts w:ascii="Microsoft YaHei" w:hAnsi="Microsoft YaHei" w:eastAsia="Microsoft YaHei"/>
+        </w:rPr>
+        <w:t>建议用法：</w:t>
+      </w:r>
+    </w:p>
+    <w:p>
+      <w:pPr>
+        <w:pStyle w:val="ListBullet"/>
+      </w:pPr>
+      <w:r>
+        <w:rPr>
+          <w:rFonts w:ascii="Microsoft YaHei" w:hAnsi="Microsoft YaHei" w:eastAsia="Microsoft YaHei"/>
+        </w:rPr>
+        <w:t>报告结论有疑问时，回到评论明细抽查原文。</w:t>
+      </w:r>
+    </w:p>
+    <w:p>
+      <w:pPr>
+        <w:pStyle w:val="ListBullet"/>
+      </w:pPr>
+      <w:r>
+        <w:rPr>
+          <w:rFonts w:ascii="Microsoft YaHei" w:hAnsi="Microsoft YaHei" w:eastAsia="Microsoft YaHei"/>
+        </w:rPr>
+        <w:t>做专题分析时，先筛选关键词，再保存视图。</w:t>
+      </w:r>
+    </w:p>
+    <w:p>
+      <w:pPr>
+        <w:pStyle w:val="ListBullet"/>
+      </w:pPr>
+      <w:r>
+        <w:rPr>
+          <w:rFonts w:ascii="Microsoft YaHei" w:hAnsi="Microsoft YaHei" w:eastAsia="Microsoft YaHei"/>
+        </w:rPr>
+        <w:t>交付外部报告前，导出关键评论作为证据。</w:t>
+      </w:r>
+    </w:p>
+    <w:p>
+      <w:pPr>
+        <w:pStyle w:val="ListBullet"/>
+      </w:pPr>
+      <w:r>
+        <w:rPr>
+          <w:rFonts w:ascii="Microsoft YaHei" w:hAnsi="Microsoft YaHei" w:eastAsia="Microsoft YaHei"/>
+        </w:rPr>
+        <w:t>发现 AI 误判时，使用人工修正沉淀反馈。</w:t>
+      </w:r>
+    </w:p>
+    <w:p>
+      <w:pPr>
+        <w:pStyle w:val="Heading2"/>
+      </w:pPr>
+      <w:r>
+        <w:rPr>
+          <w:rFonts w:ascii="Microsoft YaHei" w:hAnsi="Microsoft YaHei" w:eastAsia="Microsoft YaHei"/>
+        </w:rPr>
+        <w:t>12. 增长运营</w:t>
+      </w:r>
+    </w:p>
+    <w:p>
+      <w:r>
+        <w:rPr>
+          <w:rFonts w:ascii="Microsoft YaHei" w:hAnsi="Microsoft YaHei" w:eastAsia="Microsoft YaHei"/>
+        </w:rPr>
+        <w:t>增长运营用于把评论洞察转化为运营动作，例如内容选题、问题跟进、用户痛点处理和机会点管理。</w:t>
+      </w:r>
+    </w:p>
+    <w:p>
+      <w:pPr>
+        <w:spacing w:before="160" w:after="80"/>
+        <w:jc w:val="center"/>
+      </w:pPr>
+      <w:r>
+        <w:rPr>
+          <w:rFonts w:ascii="Microsoft YaHei" w:hAnsi="Microsoft YaHei" w:eastAsia="Microsoft YaHei"/>
+          <w:color w:val="475569"/>
+          <w:sz w:val="18"/>
+        </w:rPr>
+        <w:t>图：增长运营</w:t>
+      </w:r>
+    </w:p>
+    <w:p>
+      <w:pPr>
+        <w:jc w:val="center"/>
+      </w:pPr>
+      <w:r>
+        <w:rPr>
+          <w:rFonts w:ascii="Microsoft YaHei" w:hAnsi="Microsoft YaHei" w:eastAsia="Microsoft YaHei"/>
+        </w:rPr>
+        <w:drawing>
+          <wp:inline xmlns:a="http://schemas.openxmlformats.org/drawingml/2006/main" xmlns:pic="http://schemas.openxmlformats.org/drawingml/2006/picture">
+            <wp:extent cx="5806440" cy="3266122"/>
+            <wp:docPr id="9" name="Picture 9"/>
+            <wp:cNvGraphicFramePr>
+              <a:graphicFrameLocks noChangeAspect="1"/>
+            </wp:cNvGraphicFramePr>
+            <a:graphic>
+              <a:graphicData uri="http://schemas.openxmlformats.org/drawingml/2006/picture">
+                <pic:pic>
+                  <pic:nvPicPr>
+                    <pic:cNvPr id="0" name="08-growth.png"/>
+                    <pic:cNvPicPr/>
+                  </pic:nvPicPr>
+                  <pic:blipFill>
+                    <a:blip r:embed="rId19"/>
+                    <a:stretch>
+                      <a:fillRect/>
+                    </a:stretch>
+                  </pic:blipFill>
+                  <pic:spPr>
+                    <a:xfrm>
+                      <a:off x="0" y="0"/>
+                      <a:ext cx="5806440" cy="3266122"/>
+                    </a:xfrm>
+                    <a:prstGeom prst="rect"/>
+                  </pic:spPr>
+                </pic:pic>
+              </a:graphicData>
+            </a:graphic>
+          </wp:inline>
+        </w:drawing>
+      </w:r>
+    </w:p>
+    <w:p>
+      <w:r>
+        <w:rPr>
+          <w:rFonts w:ascii="Microsoft YaHei" w:hAnsi="Microsoft YaHei" w:eastAsia="Microsoft YaHei"/>
+        </w:rPr>
         <w:t>常见用途：</w:t>
       </w:r>
     </w:p>
@@ -2960,7 +3098,7 @@
         <w:drawing>
           <wp:inline xmlns:a="http://schemas.openxmlformats.org/drawingml/2006/main" xmlns:pic="http://schemas.openxmlformats.org/drawingml/2006/picture">
             <wp:extent cx="2377440" cy="5263423"/>
-            <wp:docPr id="9" name="Picture 9"/>
+            <wp:docPr id="10" name="Picture 10"/>
             <wp:cNvGraphicFramePr>
               <a:graphicFrameLocks noChangeAspect="1"/>
             </wp:cNvGraphicFramePr>
@@ -2972,7 +3110,7 @@
                     <pic:cNvPicPr/>
                   </pic:nvPicPr>
                   <pic:blipFill>
-                    <a:blip r:embed="rId19"/>
+                    <a:blip r:embed="rId20"/>
                     <a:stretch>
                       <a:fillRect/>
                     </a:stretch>

</xml_diff>